<commit_message>
Correccion de formato 4
</commit_message>
<xml_diff>
--- a/Entregables/L00418806_Manobanda_Formato 4 Informe.docx
+++ b/Entregables/L00418806_Manobanda_Formato 4 Informe.docx
@@ -154,16 +154,16 @@
         <mc:AlternateContent>
           <mc:Choice Requires="wps">
             <w:drawing>
-              <wp:anchor distT="0" distB="0" distL="114300" distR="114300" simplePos="0" relativeHeight="251658240" behindDoc="0" locked="0" layoutInCell="1" allowOverlap="1" wp14:anchorId="167CA30D" wp14:editId="40289B3D">
+              <wp:anchor distT="0" distB="0" distL="114300" distR="114300" simplePos="0" relativeHeight="251658240" behindDoc="0" locked="0" layoutInCell="1" allowOverlap="1" wp14:anchorId="167CA30D" wp14:editId="26767390">
                 <wp:simplePos x="0" y="0"/>
                 <wp:positionH relativeFrom="column">
-                  <wp:posOffset>158115</wp:posOffset>
+                  <wp:posOffset>160020</wp:posOffset>
                 </wp:positionH>
                 <wp:positionV relativeFrom="paragraph">
-                  <wp:posOffset>94615</wp:posOffset>
+                  <wp:posOffset>92710</wp:posOffset>
                 </wp:positionV>
-                <wp:extent cx="5476875" cy="7548245"/>
-                <wp:effectExtent l="0" t="0" r="9525" b="0"/>
+                <wp:extent cx="5476875" cy="7537450"/>
+                <wp:effectExtent l="0" t="0" r="28575" b="25400"/>
                 <wp:wrapNone/>
                 <wp:docPr id="11" name="Rectángulo redondeado 4"/>
                 <wp:cNvGraphicFramePr>
@@ -178,7 +178,7 @@
                       <wps:spPr bwMode="auto">
                         <a:xfrm>
                           <a:off x="0" y="0"/>
-                          <a:ext cx="5476875" cy="7548245"/>
+                          <a:ext cx="5476875" cy="7537450"/>
                         </a:xfrm>
                         <a:prstGeom prst="roundRect">
                           <a:avLst>
@@ -520,7 +520,47 @@
                                 <w:sz w:val="22"/>
                                 <w:lang w:val="es-EC"/>
                               </w:rPr>
-                              <w:t>SMARTPC ECUADOR SAS</w:t>
+                              <w:t>SMARTPC ECUADOR S</w:t>
+                            </w:r>
+                            <w:r>
+                              <w:rPr>
+                                <w:b/>
+                                <w:bCs/>
+                                <w:color w:val="000000"/>
+                                <w:sz w:val="22"/>
+                                <w:lang w:val="es-EC"/>
+                              </w:rPr>
+                              <w:t>.</w:t>
+                            </w:r>
+                            <w:r>
+                              <w:rPr>
+                                <w:b/>
+                                <w:bCs/>
+                                <w:color w:val="000000"/>
+                                <w:sz w:val="22"/>
+                                <w:lang w:val="es-EC"/>
+                              </w:rPr>
+                              <w:t>A</w:t>
+                            </w:r>
+                            <w:r>
+                              <w:rPr>
+                                <w:b/>
+                                <w:bCs/>
+                                <w:color w:val="000000"/>
+                                <w:sz w:val="22"/>
+                                <w:lang w:val="es-EC"/>
+                              </w:rPr>
+                              <w:t>.</w:t>
+                            </w:r>
+                            <w:r>
+                              <w:rPr>
+                                <w:b/>
+                                <w:bCs/>
+                                <w:color w:val="000000"/>
+                                <w:sz w:val="22"/>
+                                <w:lang w:val="es-EC"/>
+                              </w:rPr>
+                              <w:t>S</w:t>
                             </w:r>
                           </w:p>
                           <w:p>
@@ -630,18 +670,6 @@
                           </w:p>
                           <w:p>
                             <w:pPr>
-                              <w:jc w:val="center"/>
-                              <w:rPr>
-                                <w:b/>
-                                <w:color w:val="FF0000"/>
-                                <w:sz w:val="22"/>
-                                <w:szCs w:val="22"/>
-                                <w:lang w:val="es-EC"/>
-                              </w:rPr>
-                            </w:pPr>
-                          </w:p>
-                          <w:p>
-                            <w:pPr>
                               <w:spacing w:line="276" w:lineRule="auto"/>
                               <w:jc w:val="center"/>
                               <w:rPr>
@@ -845,15 +873,6 @@
                                 <w:szCs w:val="22"/>
                                 <w:lang w:val="es-EC"/>
                               </w:rPr>
-                              <w:t xml:space="preserve">      </w:t>
-                            </w:r>
-                            <w:r>
-                              <w:rPr>
-                                <w:b/>
-                                <w:sz w:val="18"/>
-                                <w:szCs w:val="22"/>
-                                <w:lang w:val="es-EC"/>
-                              </w:rPr>
                               <w:t>ESTUDIANTE</w:t>
                             </w:r>
                           </w:p>
@@ -915,7 +934,6 @@
                             </w:r>
                             <w:r>
                               <w:rPr>
-                                <w:rFonts w:ascii="Arial" w:hAnsi="Arial" w:cs="Arial"/>
                                 <w:b/>
                                 <w:sz w:val="16"/>
                                 <w:szCs w:val="16"/>
@@ -1053,7 +1071,6 @@
                                 <w:b/>
                                 <w:sz w:val="18"/>
                                 <w:szCs w:val="22"/>
-                                <w:lang w:val="es-EC"/>
                               </w:rPr>
                             </w:pPr>
                           </w:p>
@@ -1065,7 +1082,6 @@
                                 <w:b/>
                                 <w:sz w:val="18"/>
                                 <w:szCs w:val="22"/>
-                                <w:lang w:val="es-EC"/>
                               </w:rPr>
                             </w:pPr>
                           </w:p>
@@ -1117,7 +1133,16 @@
                                 <w:szCs w:val="22"/>
                                 <w:lang w:val="es-EC"/>
                               </w:rPr>
-                              <w:t>23</w:t>
+                              <w:t>2</w:t>
+                            </w:r>
+                            <w:r>
+                              <w:rPr>
+                                <w:b/>
+                                <w:sz w:val="20"/>
+                                <w:szCs w:val="22"/>
+                                <w:lang w:val="es-EC"/>
+                              </w:rPr>
+                              <w:t>4</w:t>
                             </w:r>
                             <w:r>
                               <w:rPr>
@@ -1175,7 +1200,7 @@
           </mc:Choice>
           <mc:Fallback>
             <w:pict>
-              <v:roundrect w14:anchorId="167CA30D" id="Rectángulo redondeado 4" o:spid="_x0000_s1026" style="position:absolute;margin-left:12.45pt;margin-top:7.45pt;width:431.25pt;height:594.35pt;z-index:251658240;visibility:visible;mso-wrap-style:square;mso-width-percent:0;mso-height-percent:0;mso-wrap-distance-left:9pt;mso-wrap-distance-top:0;mso-wrap-distance-right:9pt;mso-wrap-distance-bottom:0;mso-position-horizontal:absolute;mso-position-horizontal-relative:text;mso-position-vertical:absolute;mso-position-vertical-relative:text;mso-width-percent:0;mso-height-percent:0;mso-width-relative:page;mso-height-relative:page;v-text-anchor:top" arcsize="10923f" o:gfxdata="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">
+              <v:roundrect w14:anchorId="167CA30D" id="Rectángulo redondeado 4" o:spid="_x0000_s1026" style="position:absolute;margin-left:12.6pt;margin-top:7.3pt;width:431.25pt;height:593.5pt;z-index:251658240;visibility:visible;mso-wrap-style:square;mso-width-percent:0;mso-height-percent:0;mso-wrap-distance-left:9pt;mso-wrap-distance-top:0;mso-wrap-distance-right:9pt;mso-wrap-distance-bottom:0;mso-position-horizontal:absolute;mso-position-horizontal-relative:text;mso-position-vertical:absolute;mso-position-vertical-relative:text;mso-width-percent:0;mso-height-percent:0;mso-width-relative:page;mso-height-relative:page;v-text-anchor:top" arcsize="10923f" o:gfxdata="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">
                 <v:textbox>
                   <w:txbxContent>
                     <w:p>
@@ -1499,7 +1524,47 @@
                           <w:sz w:val="22"/>
                           <w:lang w:val="es-EC"/>
                         </w:rPr>
-                        <w:t>SMARTPC ECUADOR SAS</w:t>
+                        <w:t>SMARTPC ECUADOR S</w:t>
+                      </w:r>
+                      <w:r>
+                        <w:rPr>
+                          <w:b/>
+                          <w:bCs/>
+                          <w:color w:val="000000"/>
+                          <w:sz w:val="22"/>
+                          <w:lang w:val="es-EC"/>
+                        </w:rPr>
+                        <w:t>.</w:t>
+                      </w:r>
+                      <w:r>
+                        <w:rPr>
+                          <w:b/>
+                          <w:bCs/>
+                          <w:color w:val="000000"/>
+                          <w:sz w:val="22"/>
+                          <w:lang w:val="es-EC"/>
+                        </w:rPr>
+                        <w:t>A</w:t>
+                      </w:r>
+                      <w:r>
+                        <w:rPr>
+                          <w:b/>
+                          <w:bCs/>
+                          <w:color w:val="000000"/>
+                          <w:sz w:val="22"/>
+                          <w:lang w:val="es-EC"/>
+                        </w:rPr>
+                        <w:t>.</w:t>
+                      </w:r>
+                      <w:r>
+                        <w:rPr>
+                          <w:b/>
+                          <w:bCs/>
+                          <w:color w:val="000000"/>
+                          <w:sz w:val="22"/>
+                          <w:lang w:val="es-EC"/>
+                        </w:rPr>
+                        <w:t>S</w:t>
                       </w:r>
                     </w:p>
                     <w:p>
@@ -1609,18 +1674,6 @@
                     </w:p>
                     <w:p>
                       <w:pPr>
-                        <w:jc w:val="center"/>
-                        <w:rPr>
-                          <w:b/>
-                          <w:color w:val="FF0000"/>
-                          <w:sz w:val="22"/>
-                          <w:szCs w:val="22"/>
-                          <w:lang w:val="es-EC"/>
-                        </w:rPr>
-                      </w:pPr>
-                    </w:p>
-                    <w:p>
-                      <w:pPr>
                         <w:spacing w:line="276" w:lineRule="auto"/>
                         <w:jc w:val="center"/>
                         <w:rPr>
@@ -1824,15 +1877,6 @@
                           <w:szCs w:val="22"/>
                           <w:lang w:val="es-EC"/>
                         </w:rPr>
-                        <w:t xml:space="preserve">      </w:t>
-                      </w:r>
-                      <w:r>
-                        <w:rPr>
-                          <w:b/>
-                          <w:sz w:val="18"/>
-                          <w:szCs w:val="22"/>
-                          <w:lang w:val="es-EC"/>
-                        </w:rPr>
                         <w:t>ESTUDIANTE</w:t>
                       </w:r>
                     </w:p>
@@ -1894,7 +1938,6 @@
                       </w:r>
                       <w:r>
                         <w:rPr>
-                          <w:rFonts w:ascii="Arial" w:hAnsi="Arial" w:cs="Arial"/>
                           <w:b/>
                           <w:sz w:val="16"/>
                           <w:szCs w:val="16"/>
@@ -2032,7 +2075,6 @@
                           <w:b/>
                           <w:sz w:val="18"/>
                           <w:szCs w:val="22"/>
-                          <w:lang w:val="es-EC"/>
                         </w:rPr>
                       </w:pPr>
                     </w:p>
@@ -2044,7 +2086,6 @@
                           <w:b/>
                           <w:sz w:val="18"/>
                           <w:szCs w:val="22"/>
-                          <w:lang w:val="es-EC"/>
                         </w:rPr>
                       </w:pPr>
                     </w:p>
@@ -2096,7 +2137,16 @@
                           <w:szCs w:val="22"/>
                           <w:lang w:val="es-EC"/>
                         </w:rPr>
-                        <w:t>23</w:t>
+                        <w:t>2</w:t>
+                      </w:r>
+                      <w:r>
+                        <w:rPr>
+                          <w:b/>
+                          <w:sz w:val="20"/>
+                          <w:szCs w:val="22"/>
+                          <w:lang w:val="es-EC"/>
+                        </w:rPr>
+                        <w:t>4</w:t>
                       </w:r>
                       <w:r>
                         <w:rPr>
@@ -2544,15 +2594,6 @@
           <w:szCs w:val="20"/>
         </w:rPr>
       </w:pPr>
-    </w:p>
-    <w:p>
-      <w:pPr>
-        <w:jc w:val="both"/>
-        <w:rPr>
-          <w:sz w:val="20"/>
-          <w:szCs w:val="20"/>
-        </w:rPr>
-      </w:pPr>
       <w:r>
         <w:rPr>
           <w:noProof/>
@@ -2562,77 +2603,49 @@
         <mc:AlternateContent>
           <mc:Choice Requires="wps">
             <w:drawing>
-              <wp:anchor distT="0" distB="0" distL="114300" distR="114300" simplePos="0" relativeHeight="251665408" behindDoc="0" locked="0" layoutInCell="1" allowOverlap="1" wp14:anchorId="4687D555" wp14:editId="670623EC">
+              <wp:anchor distT="0" distB="0" distL="114300" distR="114300" simplePos="0" relativeHeight="251673600" behindDoc="0" locked="0" layoutInCell="1" allowOverlap="1" wp14:anchorId="2B9F6FFB" wp14:editId="69311305">
                 <wp:simplePos x="0" y="0"/>
                 <wp:positionH relativeFrom="column">
                   <wp:posOffset>4052570</wp:posOffset>
                 </wp:positionH>
                 <wp:positionV relativeFrom="paragraph">
-                  <wp:posOffset>5715</wp:posOffset>
+                  <wp:posOffset>6985</wp:posOffset>
                 </wp:positionV>
-                <wp:extent cx="391795" cy="257175"/>
-                <wp:effectExtent l="0" t="0" r="8255" b="9525"/>
+                <wp:extent cx="488950" cy="311150"/>
+                <wp:effectExtent l="0" t="0" r="25400" b="12700"/>
                 <wp:wrapNone/>
-                <wp:docPr id="13" name="Cuadro de texto 2"/>
-                <wp:cNvGraphicFramePr>
-                  <a:graphicFrameLocks xmlns:a="http://schemas.openxmlformats.org/drawingml/2006/main"/>
-                </wp:cNvGraphicFramePr>
+                <wp:docPr id="1132044500" name="Cuadro de texto 4"/>
+                <wp:cNvGraphicFramePr/>
                 <a:graphic xmlns:a="http://schemas.openxmlformats.org/drawingml/2006/main">
                   <a:graphicData uri="http://schemas.microsoft.com/office/word/2010/wordprocessingShape">
                     <wps:wsp>
-                      <wps:cNvSpPr txBox="1">
-                        <a:spLocks noChangeArrowheads="1"/>
-                      </wps:cNvSpPr>
-                      <wps:spPr bwMode="auto">
+                      <wps:cNvSpPr txBox="1"/>
+                      <wps:spPr>
                         <a:xfrm>
                           <a:off x="0" y="0"/>
-                          <a:ext cx="391795" cy="257175"/>
+                          <a:ext cx="488950" cy="311150"/>
                         </a:xfrm>
                         <a:prstGeom prst="rect">
                           <a:avLst/>
                         </a:prstGeom>
                         <a:solidFill>
-                          <a:srgbClr val="FFFFFF"/>
+                          <a:schemeClr val="lt1"/>
                         </a:solidFill>
-                        <a:ln w="9525">
+                        <a:ln w="6350">
                           <a:solidFill>
-                            <a:srgbClr val="000000"/>
+                            <a:prstClr val="black"/>
                           </a:solidFill>
-                          <a:miter lim="800000"/>
-                          <a:headEnd/>
-                          <a:tailEnd/>
                         </a:ln>
                       </wps:spPr>
                       <wps:txbx>
                         <w:txbxContent>
-                          <w:p>
-                            <w:pPr>
-                              <w:rPr>
-                                <w:lang w:val="en-US"/>
-                              </w:rPr>
-                            </w:pPr>
-                            <w:r>
-                              <w:rPr>
-                                <w:lang w:val="en-US"/>
-                              </w:rPr>
-                              <w:t xml:space="preserve">   </w:t>
-                            </w:r>
-                            <w:r>
-                              <w:rPr>
-                                <w:lang w:val="en-US"/>
-                              </w:rPr>
-                              <w:t xml:space="preserve">  </w:t>
-                            </w:r>
-                            <w:r>
-                              <w:rPr>
-                                <w:lang w:val="en-US"/>
-                              </w:rPr>
-                              <w:t xml:space="preserve">   </w:t>
-                            </w:r>
-                          </w:p>
+                          <w:p/>
                         </w:txbxContent>
                       </wps:txbx>
-                      <wps:bodyPr rot="0" vert="horz" wrap="square" lIns="91440" tIns="45720" rIns="91440" bIns="45720" anchor="t" anchorCtr="0">
+                      <wps:bodyPr rot="0" spcFirstLastPara="0" vertOverflow="overflow" horzOverflow="overflow" vert="horz" wrap="square" lIns="91440" tIns="45720" rIns="91440" bIns="45720" numCol="1" spcCol="0" rtlCol="0" fromWordArt="0" anchor="t" anchorCtr="0" forceAA="0" compatLnSpc="1">
+                        <a:prstTxWarp prst="textNoShape">
+                          <a:avLst/>
+                        </a:prstTxWarp>
                         <a:noAutofit/>
                       </wps:bodyPr>
                     </wps:wsp>
@@ -2649,34 +2662,14 @@
           </mc:Choice>
           <mc:Fallback>
             <w:pict>
-              <v:shape w14:anchorId="4687D555" id="Cuadro de texto 2" o:spid="_x0000_s1028" type="#_x0000_t202" style="position:absolute;left:0;text-align:left;margin-left:319.1pt;margin-top:.45pt;width:30.85pt;height:20.25pt;z-index:251665408;visibility:visible;mso-wrap-style:square;mso-width-percent:0;mso-height-percent:0;mso-wrap-distance-left:9pt;mso-wrap-distance-top:0;mso-wrap-distance-right:9pt;mso-wrap-distance-bottom:0;mso-position-horizontal:absolute;mso-position-horizontal-relative:text;mso-position-vertical:absolute;mso-position-vertical-relative:text;mso-width-percent:0;mso-height-percent:0;mso-width-relative:margin;mso-height-relative:margin;v-text-anchor:top" o:gfxdata="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">
+              <v:shapetype w14:anchorId="2B9F6FFB" id="_x0000_t202" coordsize="21600,21600" o:spt="202" path="m,l,21600r21600,l21600,xe">
+                <v:stroke joinstyle="miter"/>
+                <v:path gradientshapeok="t" o:connecttype="rect"/>
+              </v:shapetype>
+              <v:shape id="Cuadro de texto 4" o:spid="_x0000_s1028" type="#_x0000_t202" style="position:absolute;left:0;text-align:left;margin-left:319.1pt;margin-top:.55pt;width:38.5pt;height:24.5pt;z-index:251673600;visibility:visible;mso-wrap-style:square;mso-width-percent:0;mso-height-percent:0;mso-wrap-distance-left:9pt;mso-wrap-distance-top:0;mso-wrap-distance-right:9pt;mso-wrap-distance-bottom:0;mso-position-horizontal:absolute;mso-position-horizontal-relative:text;mso-position-vertical:absolute;mso-position-vertical-relative:text;mso-width-percent:0;mso-height-percent:0;mso-width-relative:margin;mso-height-relative:margin;v-text-anchor:top" o:gfxdata="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" fillcolor="white [3201]" strokeweight=".5pt">
                 <v:textbox>
                   <w:txbxContent>
-                    <w:p>
-                      <w:pPr>
-                        <w:rPr>
-                          <w:lang w:val="en-US"/>
-                        </w:rPr>
-                      </w:pPr>
-                      <w:r>
-                        <w:rPr>
-                          <w:lang w:val="en-US"/>
-                        </w:rPr>
-                        <w:t xml:space="preserve">   </w:t>
-                      </w:r>
-                      <w:r>
-                        <w:rPr>
-                          <w:lang w:val="en-US"/>
-                        </w:rPr>
-                        <w:t xml:space="preserve">  </w:t>
-                      </w:r>
-                      <w:r>
-                        <w:rPr>
-                          <w:lang w:val="en-US"/>
-                        </w:rPr>
-                        <w:t xml:space="preserve">   </w:t>
-                      </w:r>
-                    </w:p>
+                    <w:p/>
                   </w:txbxContent>
                 </v:textbox>
               </v:shape>
@@ -2684,6 +2677,15 @@
           </mc:Fallback>
         </mc:AlternateContent>
       </w:r>
+    </w:p>
+    <w:p>
+      <w:pPr>
+        <w:jc w:val="both"/>
+        <w:rPr>
+          <w:sz w:val="20"/>
+          <w:szCs w:val="20"/>
+        </w:rPr>
+      </w:pPr>
     </w:p>
     <w:p>
       <w:pPr>
@@ -3483,7 +3485,31 @@
         <w:t>ción de</w:t>
       </w:r>
       <w:r>
-        <w:t xml:space="preserve"> operaciones CRUD (Crear, Leer, Actualizar, Eliminar) para las entidades del modelo de negocio: Empresas, Empleados, Restaurantes</w:t>
+        <w:t xml:space="preserve"> operaciones</w:t>
+      </w:r>
+      <w:r>
+        <w:t xml:space="preserve"> para c</w:t>
+      </w:r>
+      <w:r>
+        <w:t xml:space="preserve">rear, </w:t>
+      </w:r>
+      <w:r>
+        <w:t>l</w:t>
+      </w:r>
+      <w:r>
+        <w:t>eer</w:t>
+      </w:r>
+      <w:r>
+        <w:t xml:space="preserve"> y</w:t>
+      </w:r>
+      <w:r>
+        <w:t xml:space="preserve"> Eliminar</w:t>
+      </w:r>
+      <w:r>
+        <w:t xml:space="preserve"> </w:t>
+      </w:r>
+      <w:r>
+        <w:t>las entidades del modelo de negocio: Empresas, Empleados, Restaurantes</w:t>
       </w:r>
       <w:r>
         <w:t xml:space="preserve"> como se observa en la Ilustración 4, Ilustración 5.</w:t>
@@ -3648,7 +3674,36 @@
         </w:r>
       </w:fldSimple>
       <w:r>
-        <w:t>. CRUD para gestión de empleados</w:t>
+        <w:t>.</w:t>
+      </w:r>
+      <w:r>
+        <w:t xml:space="preserve"> Panel</w:t>
+      </w:r>
+      <w:r>
+        <w:t xml:space="preserve"> de</w:t>
+      </w:r>
+      <w:r>
+        <w:t xml:space="preserve"> </w:t>
+      </w:r>
+      <w:proofErr w:type="spellStart"/>
+      <w:r>
+        <w:t>gesti</w:t>
+      </w:r>
+      <w:r>
+        <w:rPr>
+          <w:lang w:val="es-MX"/>
+        </w:rPr>
+        <w:t>ón</w:t>
+      </w:r>
+      <w:proofErr w:type="spellEnd"/>
+      <w:r>
+        <w:rPr>
+          <w:lang w:val="es-MX"/>
+        </w:rPr>
+        <w:t xml:space="preserve"> de</w:t>
+      </w:r>
+      <w:r>
+        <w:t xml:space="preserve"> empleados</w:t>
       </w:r>
     </w:p>
     <w:p>
@@ -4400,13 +4455,11 @@
       <w:r>
         <w:t xml:space="preserve">. </w:t>
       </w:r>
-      <w:proofErr w:type="spellStart"/>
-      <w:r>
-        <w:t>Webhooks</w:t>
-      </w:r>
-      <w:proofErr w:type="spellEnd"/>
-      <w:r>
-        <w:t xml:space="preserve"> para configuración de canales</w:t>
+      <w:r>
+        <w:t xml:space="preserve">Panel de </w:t>
+      </w:r>
+      <w:r>
+        <w:t>configuración de canales</w:t>
       </w:r>
     </w:p>
     <w:p>
@@ -5060,115 +5113,115 @@
           <w:sz w:val="24"/>
           <w:lang w:val="es-ES" w:eastAsia="es-EC"/>
         </w:rPr>
-        <w:t>Se recomienda a la empresa continuar con el proceso de mejora y actualización de las plataformas “</w:t>
-      </w:r>
-      <w:proofErr w:type="spellStart"/>
+        <w:t xml:space="preserve">Se recomienda a la universidad continuar impulsando proyectos de prácticas preprofesionales relacionados con arquitecturas de </w:t>
+      </w:r>
       <w:r>
         <w:rPr>
           <w:rFonts w:ascii="Times New Roman" w:hAnsi="Times New Roman"/>
           <w:sz w:val="24"/>
           <w:lang w:val="es-ES" w:eastAsia="es-EC"/>
         </w:rPr>
-        <w:t>MesaPass</w:t>
-      </w:r>
-      <w:proofErr w:type="spellEnd"/>
+        <w:t>software</w:t>
+      </w:r>
       <w:r>
         <w:rPr>
           <w:rFonts w:ascii="Times New Roman" w:hAnsi="Times New Roman"/>
           <w:sz w:val="24"/>
           <w:lang w:val="es-ES" w:eastAsia="es-EC"/>
         </w:rPr>
-        <w:t>” y “</w:t>
-      </w:r>
-      <w:proofErr w:type="spellStart"/>
+        <w:t xml:space="preserve"> de alta demanda, como sistemas</w:t>
+      </w:r>
       <w:r>
         <w:rPr>
           <w:rFonts w:ascii="Times New Roman" w:hAnsi="Times New Roman"/>
           <w:sz w:val="24"/>
           <w:lang w:val="es-ES" w:eastAsia="es-EC"/>
         </w:rPr>
-        <w:t>WhatsWay</w:t>
-      </w:r>
-      <w:proofErr w:type="spellEnd"/>
+        <w:t xml:space="preserve"> </w:t>
+      </w:r>
       <w:r>
         <w:rPr>
           <w:rFonts w:ascii="Times New Roman" w:hAnsi="Times New Roman"/>
           <w:sz w:val="24"/>
           <w:lang w:val="es-ES" w:eastAsia="es-EC"/>
         </w:rPr>
-        <w:t xml:space="preserve"> CRM”, incorporando nuevas funcionalidades y optimizando los </w:t>
-      </w:r>
-      <w:proofErr w:type="spellStart"/>
+        <w:t>Multi-Tenant</w:t>
+      </w:r>
       <w:r>
         <w:rPr>
           <w:rFonts w:ascii="Times New Roman" w:hAnsi="Times New Roman"/>
           <w:sz w:val="24"/>
           <w:lang w:val="es-ES" w:eastAsia="es-EC"/>
         </w:rPr>
-        <w:t>workflows</w:t>
-      </w:r>
-      <w:proofErr w:type="spellEnd"/>
+        <w:t xml:space="preserve">, plataformas </w:t>
+      </w:r>
+      <w:proofErr w:type="spellStart"/>
       <w:r>
         <w:rPr>
           <w:rFonts w:ascii="Times New Roman" w:hAnsi="Times New Roman"/>
           <w:sz w:val="24"/>
           <w:lang w:val="es-ES" w:eastAsia="es-EC"/>
         </w:rPr>
-        <w:t xml:space="preserve"> </w:t>
-      </w:r>
-      <w:proofErr w:type="spellStart"/>
+        <w:t>omnicanales</w:t>
+      </w:r>
+      <w:proofErr w:type="spellEnd"/>
       <w:r>
         <w:rPr>
           <w:rFonts w:ascii="Times New Roman" w:hAnsi="Times New Roman"/>
           <w:sz w:val="24"/>
           <w:lang w:val="es-ES" w:eastAsia="es-EC"/>
         </w:rPr>
-        <w:t>omnicanales</w:t>
-      </w:r>
-      <w:proofErr w:type="spellEnd"/>
+        <w:t xml:space="preserve"> y desarrollo </w:t>
+      </w:r>
       <w:r>
         <w:rPr>
           <w:rFonts w:ascii="Times New Roman" w:hAnsi="Times New Roman"/>
           <w:sz w:val="24"/>
           <w:lang w:val="es-ES" w:eastAsia="es-EC"/>
         </w:rPr>
-        <w:t xml:space="preserve"> implementados. También sería importante realizar un monitoreo constante del rendimiento de las bases de datos y de los tiempos de respuesta de los </w:t>
-      </w:r>
-      <w:proofErr w:type="spellStart"/>
+        <w:t>Full Stack</w:t>
+      </w:r>
       <w:r>
         <w:rPr>
           <w:rFonts w:ascii="Times New Roman" w:hAnsi="Times New Roman"/>
           <w:sz w:val="24"/>
           <w:lang w:val="es-ES" w:eastAsia="es-EC"/>
         </w:rPr>
-        <w:t>webhooks</w:t>
-      </w:r>
-      <w:proofErr w:type="spellEnd"/>
+        <w:t xml:space="preserve">. Estas experiencias permiten que los estudiantes desarrollen habilidades prácticas y conocimientos aplicados en escenarios reales de trabajo corporativo. También sería beneficioso reforzar asignaturas relacionadas con la integración avanzada de </w:t>
+      </w:r>
+      <w:proofErr w:type="spellStart"/>
       <w:r>
         <w:rPr>
           <w:rFonts w:ascii="Times New Roman" w:hAnsi="Times New Roman"/>
           <w:sz w:val="24"/>
           <w:lang w:val="es-ES" w:eastAsia="es-EC"/>
         </w:rPr>
-        <w:t xml:space="preserve"> para mantener la velocidad y estabilidad del sistema bajo altas cargas de concurrencia. Además, se aconseja fortalecer las medidas de seguridad y protección de datos en procesos relacionados con la validación de firmas criptográficas (HMAC) y el aislamiento de información sensible entre diferentes clientes (</w:t>
-      </w:r>
-      <w:proofErr w:type="spellStart"/>
+        <w:t>APIs</w:t>
+      </w:r>
+      <w:proofErr w:type="spellEnd"/>
       <w:r>
         <w:rPr>
           <w:rFonts w:ascii="Times New Roman" w:hAnsi="Times New Roman"/>
           <w:sz w:val="24"/>
           <w:lang w:val="es-ES" w:eastAsia="es-EC"/>
         </w:rPr>
-        <w:t>multi-tenant</w:t>
-      </w:r>
-      <w:proofErr w:type="spellEnd"/>
+        <w:t xml:space="preserve"> de terceros (como Meta o plataformas de pago), seguridad informática orientada a la web y diseño de arquitecturas en la nube.</w:t>
+      </w:r>
       <w:r>
         <w:rPr>
           <w:rFonts w:ascii="Times New Roman" w:hAnsi="Times New Roman"/>
           <w:sz w:val="24"/>
           <w:lang w:val="es-ES" w:eastAsia="es-EC"/>
         </w:rPr>
-        <w:t>).</w:t>
+        <w:t xml:space="preserve"> </w:t>
+      </w:r>
+      <w:r>
+        <w:rPr>
+          <w:rFonts w:ascii="Times New Roman" w:hAnsi="Times New Roman"/>
+          <w:sz w:val="24"/>
+          <w:lang w:val="es-ES" w:eastAsia="es-EC"/>
+        </w:rPr>
+        <w:t>Finalmente, incentivar la participación en proyectos colaborativos de gran escala permitirá fortalecer competencias técnicas, de análisis estructural y de trabajo en equipo.</w:t>
       </w:r>
     </w:p>
     <w:p>
@@ -5191,7 +5244,7 @@
           <w:sz w:val="24"/>
           <w:lang w:val="es-ES" w:eastAsia="es-EC"/>
         </w:rPr>
-        <w:t xml:space="preserve">Se recomienda a la universidad continuar impulsando proyectos de prácticas preprofesionales relacionados con arquitecturas de </w:t>
+        <w:t xml:space="preserve">Se recomienda </w:t>
       </w:r>
       <w:r>
         <w:rPr>
@@ -5199,7 +5252,7 @@
           <w:sz w:val="24"/>
           <w:lang w:val="es-ES" w:eastAsia="es-EC"/>
         </w:rPr>
-        <w:t>software</w:t>
+        <w:t>a la Carrera de Software incorporar en las asignaturas de Arquitectura de Software el diseño y modelado de sistemas Multi-Tenant (Software como Servicio). En el entorno empresarial actual, es fundamental que los futuros ingenieros comprendan cómo escalar una misma instancia de base de datos y aplicación para servir a múltiples organizaciones manteniendo un aislamiento de datos estricto.</w:t>
       </w:r>
       <w:r>
         <w:rPr>
@@ -5207,7 +5260,7 @@
           <w:sz w:val="24"/>
           <w:lang w:val="es-ES" w:eastAsia="es-EC"/>
         </w:rPr>
-        <w:t xml:space="preserve"> de alta demanda, como sistemas</w:t>
+        <w:t xml:space="preserve"> </w:t>
       </w:r>
       <w:r>
         <w:rPr>
@@ -5215,23 +5268,25 @@
           <w:sz w:val="24"/>
           <w:lang w:val="es-ES" w:eastAsia="es-EC"/>
         </w:rPr>
-        <w:t xml:space="preserve"> </w:t>
-      </w:r>
+        <w:t xml:space="preserve">Resulta vital que los estudiantes aprendan no solo a crear </w:t>
+      </w:r>
+      <w:proofErr w:type="spellStart"/>
       <w:r>
         <w:rPr>
           <w:rFonts w:ascii="Times New Roman" w:hAnsi="Times New Roman"/>
           <w:sz w:val="24"/>
           <w:lang w:val="es-ES" w:eastAsia="es-EC"/>
         </w:rPr>
-        <w:t>Multi-Tenant</w:t>
-      </w:r>
+        <w:t>APIs</w:t>
+      </w:r>
+      <w:proofErr w:type="spellEnd"/>
       <w:r>
         <w:rPr>
           <w:rFonts w:ascii="Times New Roman" w:hAnsi="Times New Roman"/>
           <w:sz w:val="24"/>
           <w:lang w:val="es-ES" w:eastAsia="es-EC"/>
         </w:rPr>
-        <w:t xml:space="preserve">, plataformas </w:t>
+        <w:t xml:space="preserve"> </w:t>
       </w:r>
       <w:proofErr w:type="spellStart"/>
       <w:r>
@@ -5240,7 +5295,7 @@
           <w:sz w:val="24"/>
           <w:lang w:val="es-ES" w:eastAsia="es-EC"/>
         </w:rPr>
-        <w:t>omnicanales</w:t>
+        <w:t>RESTful</w:t>
       </w:r>
       <w:proofErr w:type="spellEnd"/>
       <w:r>
@@ -5249,63 +5304,28 @@
           <w:sz w:val="24"/>
           <w:lang w:val="es-ES" w:eastAsia="es-EC"/>
         </w:rPr>
-        <w:t xml:space="preserve"> y desarrollo </w:t>
-      </w:r>
+        <w:t xml:space="preserve">, sino a consumir servicios de terceros (como plataformas de Meta, pasarelas de pago o servicios de correo) y a manejar la ingesta de </w:t>
+      </w:r>
+      <w:proofErr w:type="spellStart"/>
+      <w:r>
+        <w:rPr>
+          <w:rFonts w:ascii="Times New Roman" w:hAnsi="Times New Roman"/>
+          <w:i/>
+          <w:iCs/>
+          <w:sz w:val="24"/>
+          <w:lang w:val="es-ES" w:eastAsia="es-EC"/>
+        </w:rPr>
+        <w:t>Webhooks</w:t>
+      </w:r>
+      <w:proofErr w:type="spellEnd"/>
       <w:r>
         <w:rPr>
           <w:rFonts w:ascii="Times New Roman" w:hAnsi="Times New Roman"/>
           <w:sz w:val="24"/>
           <w:lang w:val="es-ES" w:eastAsia="es-EC"/>
         </w:rPr>
-        <w:t>Full Stack</w:t>
-      </w:r>
-      <w:r>
-        <w:rPr>
-          <w:rFonts w:ascii="Times New Roman" w:hAnsi="Times New Roman"/>
-          <w:sz w:val="24"/>
-          <w:lang w:val="es-ES" w:eastAsia="es-EC"/>
-        </w:rPr>
-        <w:t xml:space="preserve">. Estas experiencias permiten que los estudiantes desarrollen habilidades prácticas y conocimientos aplicados en escenarios reales de trabajo corporativo. También sería beneficioso reforzar asignaturas relacionadas con la integración avanzada de </w:t>
-      </w:r>
-      <w:proofErr w:type="spellStart"/>
-      <w:r>
-        <w:rPr>
-          <w:rFonts w:ascii="Times New Roman" w:hAnsi="Times New Roman"/>
-          <w:sz w:val="24"/>
-          <w:lang w:val="es-ES" w:eastAsia="es-EC"/>
-        </w:rPr>
-        <w:t>APIs</w:t>
-      </w:r>
-      <w:proofErr w:type="spellEnd"/>
-      <w:r>
-        <w:rPr>
-          <w:rFonts w:ascii="Times New Roman" w:hAnsi="Times New Roman"/>
-          <w:sz w:val="24"/>
-          <w:lang w:val="es-ES" w:eastAsia="es-EC"/>
-        </w:rPr>
-        <w:t xml:space="preserve"> de terceros (como Meta o plataformas de pago), seguridad informática orientada a la web y diseño de arquitecturas en la nube.</w:t>
-      </w:r>
-      <w:r>
-        <w:rPr>
-          <w:rFonts w:ascii="Times New Roman" w:hAnsi="Times New Roman"/>
-          <w:sz w:val="24"/>
-          <w:lang w:val="es-ES" w:eastAsia="es-EC"/>
-        </w:rPr>
-        <w:t xml:space="preserve"> </w:t>
-      </w:r>
-      <w:r>
-        <w:rPr>
-          <w:rFonts w:ascii="Times New Roman" w:hAnsi="Times New Roman"/>
-          <w:sz w:val="24"/>
-          <w:lang w:val="es-ES" w:eastAsia="es-EC"/>
-        </w:rPr>
-        <w:t>Finalmente, incentivar la participación en proyectos colaborativos de gran escala permitirá fortalecer competencias técnicas, de análisis estructural y de trabajo en equipo.</w:t>
-      </w:r>
-    </w:p>
-    <w:p>
-      <w:pPr>
-        <w:jc w:val="both"/>
-      </w:pPr>
+        <w:t xml:space="preserve"> asíncronos implementando protocolos de seguridad criptográfica como HMAC-SHA256.</w:t>
+      </w:r>
     </w:p>
     <w:sectPr>
       <w:headerReference w:type="default" r:id="rId25"/>
@@ -7803,6 +7823,7 @@
   <w:style w:type="character" w:default="1" w:styleId="Fuentedeprrafopredeter">
     <w:name w:val="Default Paragraph Font"/>
     <w:uiPriority w:val="1"/>
+    <w:semiHidden/>
     <w:unhideWhenUsed/>
   </w:style>
   <w:style w:type="table" w:default="1" w:styleId="Tablanormal">

</xml_diff>